<commit_message>
Data - 5/1/2026 - part 2
</commit_message>
<xml_diff>
--- a/Data/Private Data/Data Collections 5-1-2026.docx
+++ b/Data/Private Data/Data Collections 5-1-2026.docx
@@ -17,7 +17,7 @@
     </w:p>
     <w:p>
       <w:r>
-        <w:t>Total Rows: 5509</w:t>
+        <w:t>Total Rows: 5511</w:t>
       </w:r>
     </w:p>
     <w:p>
@@ -679,7 +679,7 @@
           <w:b w:val="0"/>
           <w:sz w:val="20"/>
         </w:rPr>
-        <w:t>169 x 14</w:t>
+        <w:t>170 x 14</w:t>
       </w:r>
       <w:r>
         <w:rPr>
@@ -3793,7 +3793,7 @@
           <w:b w:val="0"/>
           <w:sz w:val="20"/>
         </w:rPr>
-        <w:t>93 x 9</w:t>
+        <w:t>94 x 9</w:t>
       </w:r>
       <w:r>
         <w:rPr>

</xml_diff>